<commit_message>
Added ppt and media release form
</commit_message>
<xml_diff>
--- a/Documentation/ML 24-25-09 Semantic Similarity Analysis of Textual Data_Individual_Project_Nishta_Muraleedharan.docx
+++ b/Documentation/ML 24-25-09 Semantic Similarity Analysis of Textual Data_Individual_Project_Nishta_Muraleedharan.docx
@@ -103,7 +103,7 @@
         </w:rPr>
         <w:t xml:space="preserve"> </w:t>
       </w:r>
-      <w:hyperlink r:id="R7c07324a87d34ce0">
+      <w:hyperlink r:id="Ra0a7e2ef35ce4807">
         <w:r>
           <w:rPr>
             <w:rStyle w:val="Hyperlink"/>
@@ -1894,7 +1894,7 @@
         <w:jc w:val="both"/>
       </w:pPr>
     </w:p>
-    <w:p xmlns:wp14="http://schemas.microsoft.com/office/word/2010/wordml" wp14:textId="6E591B6F">
+    <w:p xmlns:wp14="http://schemas.microsoft.com/office/word/2010/wordml" wp14:textId="49531CA3">
       <w:pPr>
         <w:pStyle w:val="Heading3"/>
         <w:rPr>
@@ -1915,7 +1915,15 @@
           <w:iCs w:val="0"/>
           <w:noProof w:val="0"/>
         </w:rPr>
-        <w:t>The preprocessing module ensures that input data is properly formatted before generating embeddings. For words and phrases, preprocessing involves trimming whitespace to standardize the input. Documents undergo more extensive cleaning, including the removal of unnecessary elements such as extra spaces, email addresses, and URLs. Additionally, documents are chunked based on the mode of comparison. When comparing documents with</w:t>
+        <w:t xml:space="preserve">The preprocessing module ensures that input data is properly formatted before generating embeddings. For words and phrases, preprocessing involves trimming whitespace to standardize the input. Documents undergo more extensive cleaning, including the removal of unnecessary elements such as extra spaces, email addresses, and URLs. </w:t>
+      </w:r>
+      <w:r>
+        <w:rPr>
+          <w:i w:val="0"/>
+          <w:iCs w:val="0"/>
+          <w:noProof w:val="0"/>
+        </w:rPr>
+        <w:t>This reduces the total</w:t>
       </w:r>
       <w:r>
         <w:rPr>
@@ -1931,6 +1939,46 @@
           <w:iCs w:val="0"/>
           <w:noProof w:val="0"/>
         </w:rPr>
+        <w:t xml:space="preserve">number of tokens in the text to be embedded and </w:t>
+      </w:r>
+      <w:r>
+        <w:rPr>
+          <w:i w:val="0"/>
+          <w:iCs w:val="0"/>
+          <w:noProof w:val="0"/>
+        </w:rPr>
+        <w:t xml:space="preserve">hence </w:t>
+      </w:r>
+      <w:r>
+        <w:rPr>
+          <w:i w:val="0"/>
+          <w:iCs w:val="0"/>
+          <w:noProof w:val="0"/>
+        </w:rPr>
+        <w:t xml:space="preserve">saves on computational cost. </w:t>
+      </w:r>
+      <w:r>
+        <w:rPr>
+          <w:i w:val="0"/>
+          <w:iCs w:val="0"/>
+          <w:noProof w:val="0"/>
+        </w:rPr>
+        <w:t>Additionally, documents are chunked based on the mode of comparison. When comparing documents with</w:t>
+      </w:r>
+      <w:r>
+        <w:rPr>
+          <w:i w:val="0"/>
+          <w:iCs w:val="0"/>
+          <w:noProof w:val="0"/>
+        </w:rPr>
+        <w:t xml:space="preserve"> </w:t>
+      </w:r>
+      <w:r>
+        <w:rPr>
+          <w:i w:val="0"/>
+          <w:iCs w:val="0"/>
+          <w:noProof w:val="0"/>
+        </w:rPr>
         <w:t>words or phrases, chunking is essential</w:t>
       </w:r>
       <w:r>
@@ -2043,7 +2091,45 @@
           <w:iCs w:val="0"/>
           <w:noProof w:val="0"/>
         </w:rPr>
-        <w:t xml:space="preserve"> In contrast, when comparing documents with other documents, the focus is on capturing the overall contextual similarity rather than specific details. Since single embeddings are effective at </w:t>
+        <w:t xml:space="preserve"> </w:t>
+      </w:r>
+    </w:p>
+    <w:p xmlns:wp14="http://schemas.microsoft.com/office/word/2010/wordml" wp14:textId="6B065F19">
+      <w:pPr>
+        <w:pStyle w:val="Heading3"/>
+        <w:numPr>
+          <w:ilvl w:val="0"/>
+          <w:numId w:val="0"/>
+        </w:numPr>
+        <w:ind w:left="0" w:firstLine="288"/>
+        <w:rPr>
+          <w:i w:val="0"/>
+          <w:iCs w:val="0"/>
+          <w:noProof w:val="0"/>
+        </w:rPr>
+      </w:pPr>
+    </w:p>
+    <w:p xmlns:wp14="http://schemas.microsoft.com/office/word/2010/wordml" wp14:textId="427D749A">
+      <w:pPr>
+        <w:pStyle w:val="Heading3"/>
+        <w:numPr>
+          <w:ilvl w:val="0"/>
+          <w:numId w:val="0"/>
+        </w:numPr>
+        <w:ind w:left="0" w:firstLine="288"/>
+        <w:rPr>
+          <w:i w:val="0"/>
+          <w:iCs w:val="0"/>
+          <w:noProof w:val="0"/>
+        </w:rPr>
+      </w:pPr>
+      <w:r>
+        <w:rPr>
+          <w:i w:val="0"/>
+          <w:iCs w:val="0"/>
+          <w:noProof w:val="0"/>
+        </w:rPr>
+        <w:t xml:space="preserve">In contrast, when comparing documents with other documents, the focus is on capturing the overall contextual similarity rather than specific details. Since single embeddings are effective at </w:t>
       </w:r>
       <w:r>
         <w:rPr>
@@ -5000,7 +5086,7 @@
         </w:rPr>
         <w:t xml:space="preserve"> all results can be accessed at the following link: </w:t>
       </w:r>
-      <w:hyperlink r:id="R60e0defe7fd5490e">
+      <w:hyperlink r:id="R3d96a27793cb4ec8">
         <w:r>
           <w:rPr>
             <w:rStyle w:val="Hyperlink"/>
@@ -7475,7 +7561,7 @@
         <w:t xml:space="preserve"> consistently outperformed other models, and cosine similarity was identified as the most reliable metric due to its robustness across different embedding scales.</w:t>
       </w:r>
     </w:p>
-    <w:p xmlns:wp14="http://schemas.microsoft.com/office/word/2010/wordml" wp14:textId="4B4A4070">
+    <w:p>
       <w:pPr>
         <w:spacing w:before="240" w:after="240"/>
         <w:ind w:firstLine="720"/>
@@ -7502,72 +7588,310 @@
         </w:rPr>
         <w:t>, an interactive Dash-based web application was developed to visualize similarity relationships using bar graphs, scatter plots, and three-dimensional plots, aiding in result interpretation.</w:t>
       </w:r>
-    </w:p>
-    <w:p xmlns:wp14="http://schemas.microsoft.com/office/word/2010/wordml" wp14:textId="77777777">
-      <w:pPr>
-        <w:spacing w:before="240" w:after="240"/>
-        <w:ind w:firstLine="720"/>
+      <w:r>
+        <w:rPr>
+          <w:rFonts w:eastAsia="Times New Roman"/>
+        </w:rPr>
+        <w:t xml:space="preserve"> </w:t>
+      </w:r>
+      <w:r>
+        <w:rPr>
+          <w:rFonts w:eastAsia="Times New Roman"/>
+        </w:rPr>
+        <w:t xml:space="preserve">However, the approach comes with increased computational cost and processing time, </w:t>
+      </w:r>
+      <w:r>
+        <w:rPr>
+          <w:rFonts w:eastAsia="Times New Roman"/>
+        </w:rPr>
+        <w:t>which may</w:t>
+      </w:r>
+      <w:r>
+        <w:rPr>
+          <w:rFonts w:eastAsia="Times New Roman"/>
+        </w:rPr>
+        <w:t xml:space="preserve"> slow down the application, </w:t>
+      </w:r>
+      <w:r>
+        <w:rPr>
+          <w:rFonts w:eastAsia="Times New Roman"/>
+        </w:rPr>
+        <w:t xml:space="preserve">when used for comparing big </w:t>
+      </w:r>
+      <w:r>
+        <w:rPr>
+          <w:rFonts w:eastAsia="Times New Roman"/>
+        </w:rPr>
+        <w:t>document</w:t>
+      </w:r>
+      <w:r>
+        <w:rPr>
+          <w:rFonts w:eastAsia="Times New Roman"/>
+        </w:rPr>
+        <w:t>s on a larger scale</w:t>
+      </w:r>
+      <w:r>
+        <w:rPr>
+          <w:rFonts w:eastAsia="Times New Roman"/>
+        </w:rPr>
+        <w:t>.</w:t>
+      </w:r>
+    </w:p>
+    <w:p>
+      <w:pPr>
+        <w:pStyle w:val="Normal"/>
+        <w:suppressLineNumbers w:val="0"/>
+        <w:bidi w:val="0"/>
+        <w:spacing w:before="240" w:beforeAutospacing="off" w:after="240" w:afterAutospacing="off" w:line="259" w:lineRule="auto"/>
+        <w:ind w:left="0" w:right="0" w:firstLine="720"/>
         <w:jc w:val="both"/>
-      </w:pPr>
-      <w:r>
-        <w:rPr>
-          <w:rFonts w:eastAsia="Times New Roman"/>
-        </w:rPr>
-        <w:t xml:space="preserve">This work provides a foundation for enhanced text similarity analysis and retrieval. Future improvements could include testing additional embedding </w:t>
-      </w:r>
-      <w:r>
-        <w:rPr>
-          <w:rFonts w:eastAsia="Times New Roman"/>
-        </w:rPr>
-        <w:t>models and</w:t>
-      </w:r>
-      <w:r>
-        <w:rPr>
-          <w:rFonts w:eastAsia="Times New Roman"/>
-        </w:rPr>
-        <w:t xml:space="preserve"> integrating more advanced visualization techniques. </w:t>
-      </w:r>
-      <w:r>
-        <w:rPr>
-          <w:rFonts w:eastAsia="Times New Roman"/>
-        </w:rPr>
-        <w:t xml:space="preserve">The application can be adapted to be certain </w:t>
-      </w:r>
-      <w:r>
-        <w:rPr>
-          <w:rFonts w:eastAsia="Times New Roman"/>
-        </w:rPr>
-        <w:t>domain-specific</w:t>
-      </w:r>
-      <w:r>
-        <w:rPr>
-          <w:rFonts w:eastAsia="Times New Roman"/>
-        </w:rPr>
-        <w:t xml:space="preserve"> by optimizing </w:t>
-      </w:r>
-      <w:r>
-        <w:rPr>
-          <w:rFonts w:eastAsia="Times New Roman"/>
-        </w:rPr>
-        <w:t xml:space="preserve">chunking and </w:t>
-      </w:r>
-      <w:r>
-        <w:rPr>
-          <w:rFonts w:eastAsia="Times New Roman"/>
-        </w:rPr>
-        <w:t xml:space="preserve">weighting </w:t>
-      </w:r>
-      <w:r>
-        <w:rPr>
-          <w:rFonts w:eastAsia="Times New Roman"/>
-        </w:rPr>
-        <w:t>parameters, this could</w:t>
-      </w:r>
-      <w:r>
-        <w:rPr>
-          <w:rFonts w:eastAsia="Times New Roman"/>
-        </w:rPr>
-        <w:t xml:space="preserve"> further increase its applicability across diverse fields such as academic research, legal document analysis, and content recommendation systems.</w:t>
+        <w:rPr>
+          <w:rFonts w:ascii="Times New Roman" w:hAnsi="Times New Roman" w:eastAsia="Times New Roman" w:cs="Times New Roman"/>
+          <w:noProof w:val="0"/>
+          <w:sz w:val="20"/>
+          <w:szCs w:val="20"/>
+          <w:lang w:val="en-US"/>
+        </w:rPr>
+      </w:pPr>
+      <w:r>
+        <w:rPr>
+          <w:rFonts w:ascii="Times New Roman" w:hAnsi="Times New Roman" w:eastAsia="Times New Roman" w:cs="Times New Roman"/>
+          <w:noProof w:val="0"/>
+          <w:sz w:val="20"/>
+          <w:szCs w:val="20"/>
+          <w:lang w:val="en-US"/>
+        </w:rPr>
+        <w:t xml:space="preserve">Future improvements to this work </w:t>
+      </w:r>
+      <w:r>
+        <w:rPr>
+          <w:rFonts w:ascii="Times New Roman" w:hAnsi="Times New Roman" w:eastAsia="Times New Roman" w:cs="Times New Roman"/>
+          <w:noProof w:val="0"/>
+          <w:sz w:val="20"/>
+          <w:szCs w:val="20"/>
+          <w:lang w:val="en-US"/>
+        </w:rPr>
+        <w:t xml:space="preserve">can include </w:t>
+      </w:r>
+      <w:r>
+        <w:rPr>
+          <w:rFonts w:ascii="Times New Roman" w:hAnsi="Times New Roman" w:eastAsia="Times New Roman" w:cs="Times New Roman"/>
+          <w:noProof w:val="0"/>
+          <w:sz w:val="20"/>
+          <w:szCs w:val="20"/>
+          <w:lang w:val="en-US"/>
+        </w:rPr>
+        <w:t>enhanc</w:t>
+      </w:r>
+      <w:r>
+        <w:rPr>
+          <w:rFonts w:ascii="Times New Roman" w:hAnsi="Times New Roman" w:eastAsia="Times New Roman" w:cs="Times New Roman"/>
+          <w:noProof w:val="0"/>
+          <w:sz w:val="20"/>
+          <w:szCs w:val="20"/>
+          <w:lang w:val="en-US"/>
+        </w:rPr>
+        <w:t xml:space="preserve">ing </w:t>
+      </w:r>
+      <w:r>
+        <w:rPr>
+          <w:rFonts w:ascii="Times New Roman" w:hAnsi="Times New Roman" w:eastAsia="Times New Roman" w:cs="Times New Roman"/>
+          <w:noProof w:val="0"/>
+          <w:sz w:val="20"/>
+          <w:szCs w:val="20"/>
+          <w:lang w:val="en-US"/>
+        </w:rPr>
+        <w:t xml:space="preserve">performance through the implementation of multithreading, which can significantly reduce processing time for large datasets by parallelizing embedding generation and similarity calculations. Additionally, the application </w:t>
+      </w:r>
+      <w:r>
+        <w:rPr>
+          <w:rFonts w:ascii="Times New Roman" w:hAnsi="Times New Roman" w:eastAsia="Times New Roman" w:cs="Times New Roman"/>
+          <w:noProof w:val="0"/>
+          <w:sz w:val="20"/>
+          <w:szCs w:val="20"/>
+          <w:lang w:val="en-US"/>
+        </w:rPr>
+        <w:t xml:space="preserve">has the potential to be </w:t>
+      </w:r>
+      <w:r>
+        <w:rPr>
+          <w:rFonts w:ascii="Times New Roman" w:hAnsi="Times New Roman" w:eastAsia="Times New Roman" w:cs="Times New Roman"/>
+          <w:noProof w:val="0"/>
+          <w:sz w:val="20"/>
+          <w:szCs w:val="20"/>
+          <w:lang w:val="en-US"/>
+        </w:rPr>
+        <w:t>refined for specific domains by customizing preprocessing techniques and fine-tuning the β value in the exponentially weighted mean function</w:t>
+      </w:r>
+      <w:r>
+        <w:rPr>
+          <w:rFonts w:ascii="Times New Roman" w:hAnsi="Times New Roman" w:eastAsia="Times New Roman" w:cs="Times New Roman"/>
+          <w:noProof w:val="0"/>
+          <w:sz w:val="20"/>
+          <w:szCs w:val="20"/>
+          <w:lang w:val="en-US"/>
+        </w:rPr>
+        <w:t xml:space="preserve">. </w:t>
+      </w:r>
+      <w:r>
+        <w:rPr>
+          <w:rFonts w:ascii="Times New Roman" w:hAnsi="Times New Roman" w:eastAsia="Times New Roman" w:cs="Times New Roman"/>
+          <w:noProof w:val="0"/>
+          <w:sz w:val="20"/>
+          <w:szCs w:val="20"/>
+          <w:lang w:val="en-US"/>
+        </w:rPr>
+        <w:t xml:space="preserve">When customizing for a specific domain, </w:t>
+      </w:r>
+      <w:r>
+        <w:rPr>
+          <w:rFonts w:ascii="Times New Roman" w:hAnsi="Times New Roman" w:eastAsia="Times New Roman" w:cs="Times New Roman"/>
+          <w:noProof w:val="0"/>
+          <w:sz w:val="20"/>
+          <w:szCs w:val="20"/>
+          <w:lang w:val="en-US"/>
+        </w:rPr>
+        <w:t xml:space="preserve">document chunking </w:t>
+      </w:r>
+      <w:r>
+        <w:rPr>
+          <w:rFonts w:ascii="Times New Roman" w:hAnsi="Times New Roman" w:eastAsia="Times New Roman" w:cs="Times New Roman"/>
+          <w:noProof w:val="0"/>
+          <w:sz w:val="20"/>
+          <w:szCs w:val="20"/>
+          <w:lang w:val="en-US"/>
+        </w:rPr>
+        <w:t xml:space="preserve">can be more </w:t>
+      </w:r>
+      <w:r>
+        <w:rPr>
+          <w:rFonts w:ascii="Times New Roman" w:hAnsi="Times New Roman" w:eastAsia="Times New Roman" w:cs="Times New Roman"/>
+          <w:noProof w:val="0"/>
+          <w:sz w:val="20"/>
+          <w:szCs w:val="20"/>
+          <w:lang w:val="en-US"/>
+        </w:rPr>
+        <w:t>optimized</w:t>
+      </w:r>
+      <w:r>
+        <w:rPr>
+          <w:rFonts w:ascii="Times New Roman" w:hAnsi="Times New Roman" w:eastAsia="Times New Roman" w:cs="Times New Roman"/>
+          <w:noProof w:val="0"/>
+          <w:sz w:val="20"/>
+          <w:szCs w:val="20"/>
+          <w:lang w:val="en-US"/>
+        </w:rPr>
+        <w:t xml:space="preserve"> by i</w:t>
+      </w:r>
+      <w:r>
+        <w:rPr>
+          <w:rFonts w:ascii="Times New Roman" w:hAnsi="Times New Roman" w:eastAsia="Times New Roman" w:cs="Times New Roman"/>
+          <w:noProof w:val="0"/>
+          <w:sz w:val="20"/>
+          <w:szCs w:val="20"/>
+          <w:lang w:val="en-US"/>
+        </w:rPr>
+        <w:t>ncorporating advanced semantic chunking</w:t>
+      </w:r>
+      <w:r>
+        <w:rPr>
+          <w:rFonts w:ascii="Times New Roman" w:hAnsi="Times New Roman" w:eastAsia="Times New Roman" w:cs="Times New Roman"/>
+          <w:noProof w:val="0"/>
+          <w:sz w:val="20"/>
+          <w:szCs w:val="20"/>
+          <w:lang w:val="en-US"/>
+        </w:rPr>
+        <w:t xml:space="preserve"> methods</w:t>
+      </w:r>
+      <w:r>
+        <w:rPr>
+          <w:rFonts w:ascii="Times New Roman" w:hAnsi="Times New Roman" w:eastAsia="Times New Roman" w:cs="Times New Roman"/>
+          <w:noProof w:val="0"/>
+          <w:sz w:val="20"/>
+          <w:szCs w:val="20"/>
+          <w:lang w:val="en-US"/>
+        </w:rPr>
+        <w:t xml:space="preserve">. This can </w:t>
+      </w:r>
+      <w:r>
+        <w:rPr>
+          <w:rFonts w:ascii="Times New Roman" w:hAnsi="Times New Roman" w:eastAsia="Times New Roman" w:cs="Times New Roman"/>
+          <w:noProof w:val="0"/>
+          <w:sz w:val="20"/>
+          <w:szCs w:val="20"/>
+          <w:lang w:val="en-US"/>
+        </w:rPr>
+        <w:t>enhance accuracy by dynamically adjusting chunk sizes based on content structure</w:t>
+      </w:r>
+      <w:r>
+        <w:rPr>
+          <w:rFonts w:ascii="Times New Roman" w:hAnsi="Times New Roman" w:eastAsia="Times New Roman" w:cs="Times New Roman"/>
+          <w:noProof w:val="0"/>
+          <w:sz w:val="20"/>
+          <w:szCs w:val="20"/>
+          <w:lang w:val="en-US"/>
+        </w:rPr>
+        <w:t xml:space="preserve"> </w:t>
+      </w:r>
+      <w:r>
+        <w:rPr>
+          <w:rFonts w:ascii="Times New Roman" w:hAnsi="Times New Roman" w:eastAsia="Times New Roman" w:cs="Times New Roman"/>
+          <w:noProof w:val="0"/>
+          <w:sz w:val="20"/>
+          <w:szCs w:val="20"/>
+          <w:lang w:val="en-US"/>
+        </w:rPr>
+        <w:t>and</w:t>
+      </w:r>
+      <w:r>
+        <w:rPr>
+          <w:rFonts w:ascii="Times New Roman" w:hAnsi="Times New Roman" w:eastAsia="Times New Roman" w:cs="Times New Roman"/>
+          <w:noProof w:val="0"/>
+          <w:sz w:val="20"/>
+          <w:szCs w:val="20"/>
+          <w:lang w:val="en-US"/>
+        </w:rPr>
+        <w:t xml:space="preserve"> </w:t>
+      </w:r>
+      <w:r>
+        <w:rPr>
+          <w:rFonts w:ascii="Times New Roman" w:hAnsi="Times New Roman" w:eastAsia="Times New Roman" w:cs="Times New Roman"/>
+          <w:noProof w:val="0"/>
+          <w:sz w:val="20"/>
+          <w:szCs w:val="20"/>
+          <w:lang w:val="en-US"/>
+        </w:rPr>
+        <w:t>optimize</w:t>
+      </w:r>
+      <w:r>
+        <w:rPr>
+          <w:rFonts w:ascii="Times New Roman" w:hAnsi="Times New Roman" w:eastAsia="Times New Roman" w:cs="Times New Roman"/>
+          <w:noProof w:val="0"/>
+          <w:sz w:val="20"/>
+          <w:szCs w:val="20"/>
+          <w:lang w:val="en-US"/>
+        </w:rPr>
+        <w:t xml:space="preserve"> performance</w:t>
+      </w:r>
+      <w:r>
+        <w:rPr>
+          <w:rFonts w:ascii="Times New Roman" w:hAnsi="Times New Roman" w:eastAsia="Times New Roman" w:cs="Times New Roman"/>
+          <w:noProof w:val="0"/>
+          <w:sz w:val="20"/>
+          <w:szCs w:val="20"/>
+          <w:lang w:val="en-US"/>
+        </w:rPr>
+        <w:t xml:space="preserve">. Furthermore, expanding the application to support newer embedding models will provide greater flexibility and potentially improve performance in various text similarity tasks. These enhancements will contribute to making the system more scalable, efficient, and adaptable for real-world applications across different fields, such as academic </w:t>
+      </w:r>
+      <w:r>
+        <w:rPr>
+          <w:rFonts w:ascii="Times New Roman" w:hAnsi="Times New Roman" w:eastAsia="Times New Roman" w:cs="Times New Roman"/>
+          <w:noProof w:val="0"/>
+          <w:sz w:val="20"/>
+          <w:szCs w:val="20"/>
+          <w:lang w:val="en-US"/>
+        </w:rPr>
+        <w:t>research, legal document analysis, and content recommendation systems.</w:t>
       </w:r>
     </w:p>
     <w:p xmlns:wp14="http://schemas.microsoft.com/office/word/2010/wordml" wp14:textId="77777777">
@@ -7579,25 +7903,28 @@
       </w:r>
     </w:p>
     <w:p xmlns:wp14="http://schemas.microsoft.com/office/word/2010/wordml" wp14:textId="77777777"/>
-    <w:p xmlns:wp14="http://schemas.microsoft.com/office/word/2010/wordml" wp14:textId="77777777">
+    <w:p>
       <w:pPr>
         <w:pStyle w:val="references"/>
+        <w:rPr/>
       </w:pPr>
       <w:bookmarkStart w:name="Bookmark1" w:id="0"/>
       <w:r>
+        <w:rPr/>
         <w:t xml:space="preserve">H. Cao, “Recent advances in text embedding: A comprehensive review of top-performing methods on the MTEB benchmark,” </w:t>
       </w:r>
       <w:r>
         <w:rPr>
-          <w:i/>
-          <w:iCs/>
+          <w:i w:val="1"/>
+          <w:iCs w:val="1"/>
         </w:rPr>
         <w:t>arXiv preprint</w:t>
       </w:r>
       <w:r>
+        <w:rPr/>
         <w:t xml:space="preserve">, arXiv:2406.01607, 2024. Available: </w:t>
       </w:r>
-      <w:hyperlink r:id="rId27">
+      <w:hyperlink r:id="Rfd92e2e5d5524d05">
         <w:r>
           <w:rPr>
             <w:rStyle w:val="Hyperlink"/>
@@ -7606,40 +7933,59 @@
         </w:r>
       </w:hyperlink>
       <w:r>
+        <w:rPr/>
         <w:t>.</w:t>
       </w:r>
       <w:bookmarkEnd w:id="0"/>
     </w:p>
-    <w:p xmlns:wp14="http://schemas.microsoft.com/office/word/2010/wordml" wp14:textId="77777777">
+    <w:p>
       <w:pPr>
         <w:pStyle w:val="references"/>
-      </w:pPr>
-      <w:bookmarkStart w:name="Bookmark2" w:id="1"/>
-      <w:r>
-        <w:t xml:space="preserve">M. Ostendorff, T. Blume, T. Ruas, B. Gipp, and G. Rehm, “Specialized document embeddings for aspect-based similarity of research papers,” in </w:t>
-      </w:r>
-      <w:r>
-        <w:rPr>
-          <w:i/>
-          <w:iCs/>
-        </w:rPr>
-        <w:t>Proceedings of the 22nd ACM/IEEE Joint Conference on Digital Libraries (JCDL '22)</w:t>
-      </w:r>
-      <w:r>
-        <w:t xml:space="preserve">, Article No. 7, pp. 1–12, June 2022. doi: </w:t>
-      </w:r>
-      <w:hyperlink r:id="rId28">
+        <w:rPr>
+          <w:noProof/>
+          <w:lang w:val="en-US"/>
+        </w:rPr>
+      </w:pPr>
+      <w:r>
+        <w:rPr>
+          <w:noProof/>
+          <w:lang w:val="en-US"/>
+        </w:rPr>
+        <w:t xml:space="preserve">S. Zhang, Y. Liang, M. Gong, D. Jiang, and N. Duan, “Multi-view document representation learning for open-domain dense retrieval,” </w:t>
+      </w:r>
+      <w:r>
+        <w:rPr>
+          <w:i w:val="1"/>
+          <w:iCs w:val="1"/>
+          <w:noProof/>
+          <w:lang w:val="en-US"/>
+        </w:rPr>
+        <w:t>arXiv preprint</w:t>
+      </w:r>
+      <w:r>
+        <w:rPr>
+          <w:noProof/>
+          <w:lang w:val="en-US"/>
+        </w:rPr>
+        <w:t xml:space="preserve">, vol. 2203.08372, 2022. Available: </w:t>
+      </w:r>
+      <w:hyperlink r:id="R1468315827c54a52">
         <w:r>
           <w:rPr>
             <w:rStyle w:val="Hyperlink"/>
+            <w:noProof/>
+            <w:lang w:val="en-US"/>
           </w:rPr>
-          <w:t>10.1145/3529372.3530912</w:t>
+          <w:t>https://arxiv.org/abs/2203.08372</w:t>
         </w:r>
       </w:hyperlink>
       <w:r>
+        <w:rPr>
+          <w:noProof/>
+          <w:lang w:val="en-US"/>
+        </w:rPr>
         <w:t>.</w:t>
       </w:r>
-      <w:bookmarkEnd w:id="1"/>
     </w:p>
     <w:p xmlns:wp14="http://schemas.microsoft.com/office/word/2010/wordml" wp14:textId="77777777">
       <w:pPr>
@@ -7902,6 +8248,91 @@
 
 <file path=word/numbering.xml><?xml version="1.0" encoding="utf-8"?>
 <w:numbering xmlns:ve="http://schemas.openxmlformats.org/markup-compatibility/2006" xmlns:o="urn:schemas-microsoft-com:office:office" xmlns:r="http://schemas.openxmlformats.org/officeDocument/2006/relationships" xmlns:m="http://schemas.openxmlformats.org/officeDocument/2006/math" xmlns:v="urn:schemas-microsoft-com:vml" xmlns:wp="http://schemas.openxmlformats.org/drawingml/2006/wordprocessingDrawing" xmlns:w10="urn:schemas-microsoft-com:office:word" xmlns:w="http://schemas.openxmlformats.org/wordprocessingml/2006/main" xmlns:wne="http://schemas.microsoft.com/office/word/2006/wordml">
+  <w:abstractNum xmlns:w="http://schemas.openxmlformats.org/wordprocessingml/2006/main" w:abstractNumId="11">
+    <w:nsid w:val="6da40e89"/>
+    <w:multiLevelType xmlns:w="http://schemas.openxmlformats.org/wordprocessingml/2006/main" w:val="hybridMultilevel"/>
+    <w:lvl xmlns:w="http://schemas.openxmlformats.org/wordprocessingml/2006/main" w:ilvl="0">
+      <w:start w:val="1"/>
+      <w:numFmt w:val="decimal"/>
+      <w:lvlText w:val="[%1]"/>
+      <w:lvlJc w:val="left"/>
+      <w:pPr>
+        <w:ind w:left="720" w:hanging="360"/>
+      </w:pPr>
+    </w:lvl>
+    <w:lvl xmlns:w="http://schemas.openxmlformats.org/wordprocessingml/2006/main" w:ilvl="1">
+      <w:start w:val="1"/>
+      <w:numFmt w:val="lowerLetter"/>
+      <w:lvlText w:val="%2."/>
+      <w:lvlJc w:val="left"/>
+      <w:pPr>
+        <w:ind w:left="1440" w:hanging="360"/>
+      </w:pPr>
+    </w:lvl>
+    <w:lvl xmlns:w="http://schemas.openxmlformats.org/wordprocessingml/2006/main" w:ilvl="2">
+      <w:start w:val="1"/>
+      <w:numFmt w:val="lowerRoman"/>
+      <w:lvlText w:val="%3."/>
+      <w:lvlJc w:val="right"/>
+      <w:pPr>
+        <w:ind w:left="2160" w:hanging="180"/>
+      </w:pPr>
+    </w:lvl>
+    <w:lvl xmlns:w="http://schemas.openxmlformats.org/wordprocessingml/2006/main" w:ilvl="3">
+      <w:start w:val="1"/>
+      <w:numFmt w:val="decimal"/>
+      <w:lvlText w:val="%4."/>
+      <w:lvlJc w:val="left"/>
+      <w:pPr>
+        <w:ind w:left="2880" w:hanging="360"/>
+      </w:pPr>
+    </w:lvl>
+    <w:lvl xmlns:w="http://schemas.openxmlformats.org/wordprocessingml/2006/main" w:ilvl="4">
+      <w:start w:val="1"/>
+      <w:numFmt w:val="lowerLetter"/>
+      <w:lvlText w:val="%5."/>
+      <w:lvlJc w:val="left"/>
+      <w:pPr>
+        <w:ind w:left="3600" w:hanging="360"/>
+      </w:pPr>
+    </w:lvl>
+    <w:lvl xmlns:w="http://schemas.openxmlformats.org/wordprocessingml/2006/main" w:ilvl="5">
+      <w:start w:val="1"/>
+      <w:numFmt w:val="lowerRoman"/>
+      <w:lvlText w:val="%6."/>
+      <w:lvlJc w:val="right"/>
+      <w:pPr>
+        <w:ind w:left="4320" w:hanging="180"/>
+      </w:pPr>
+    </w:lvl>
+    <w:lvl xmlns:w="http://schemas.openxmlformats.org/wordprocessingml/2006/main" w:ilvl="6">
+      <w:start w:val="1"/>
+      <w:numFmt w:val="decimal"/>
+      <w:lvlText w:val="%7."/>
+      <w:lvlJc w:val="left"/>
+      <w:pPr>
+        <w:ind w:left="5040" w:hanging="360"/>
+      </w:pPr>
+    </w:lvl>
+    <w:lvl xmlns:w="http://schemas.openxmlformats.org/wordprocessingml/2006/main" w:ilvl="7">
+      <w:start w:val="1"/>
+      <w:numFmt w:val="lowerLetter"/>
+      <w:lvlText w:val="%8."/>
+      <w:lvlJc w:val="left"/>
+      <w:pPr>
+        <w:ind w:left="5760" w:hanging="360"/>
+      </w:pPr>
+    </w:lvl>
+    <w:lvl xmlns:w="http://schemas.openxmlformats.org/wordprocessingml/2006/main" w:ilvl="8">
+      <w:start w:val="1"/>
+      <w:numFmt w:val="lowerRoman"/>
+      <w:lvlText w:val="%9."/>
+      <w:lvlJc w:val="right"/>
+      <w:pPr>
+        <w:ind w:left="6480" w:hanging="180"/>
+      </w:pPr>
+    </w:lvl>
+  </w:abstractNum>
   <w:abstractNum w:abstractNumId="0">
     <w:nsid w:val="26FE1FCF"/>
     <w:multiLevelType w:val="hybridMultilevel"/>
@@ -9151,6 +9582,9 @@
       </w:rPr>
     </w:lvl>
   </w:abstractNum>
+  <w:num w:numId="14">
+    <w:abstractNumId w:val="11"/>
+  </w:num>
   <w:num w:numId="1">
     <w:abstractNumId w:val="10"/>
   </w:num>

</xml_diff>